<commit_message>
Merge con repositorio remoto
</commit_message>
<xml_diff>
--- a/Herramientas_Ofimáticas.docx
+++ b/Herramientas_Ofimáticas.docx
@@ -25,7 +25,7 @@
           <w:sz w:val="22"/>
           <w:szCs w:val="22"/>
         </w:rPr>
-        <w:t>INSTITUCIÓN EDUCATIVA</w:t>
+        <w:t>Fundación Universitaria San Mateo</w:t>
       </w:r>
     </w:p>
     <w:p/>
@@ -116,87 +116,18 @@
     <w:p>
       <w:pPr>
         <w:ind w:left="2124"/>
-        <w:rPr>
-          <w:lang w:val="pt-BR"/>
-        </w:rPr>
       </w:pPr>
       <w:r>
         <w:rPr>
           <w:color w:val="333333"/>
-          <w:lang w:val="pt-BR"/>
         </w:rPr>
-        <w:t xml:space="preserve">       </w:t>
-      </w:r>
-      <w:r>
-        <w:rPr>
-          <w:color w:val="333333"/>
-          <w:lang w:val="pt-BR"/>
-        </w:rPr>
-        <w:t>G</w:t>
-      </w:r>
-      <w:r>
-        <w:rPr>
-          <w:color w:val="333333"/>
-          <w:lang w:val="pt-BR"/>
-        </w:rPr>
-        <w:t>iovana</w:t>
-      </w:r>
-      <w:r>
-        <w:rPr>
-          <w:color w:val="333333"/>
-          <w:lang w:val="pt-BR"/>
-        </w:rPr>
-        <w:t xml:space="preserve"> C</w:t>
-      </w:r>
-      <w:r>
-        <w:rPr>
-          <w:color w:val="333333"/>
-          <w:lang w:val="pt-BR"/>
-        </w:rPr>
-        <w:t>arolina</w:t>
-      </w:r>
-      <w:r>
-        <w:rPr>
-          <w:color w:val="333333"/>
-          <w:lang w:val="pt-BR"/>
-        </w:rPr>
-        <w:t xml:space="preserve"> </w:t>
-      </w:r>
-      <w:r>
-        <w:rPr>
-          <w:color w:val="333333"/>
-          <w:lang w:val="pt-BR"/>
-        </w:rPr>
-        <w:t>Cárdenas</w:t>
-      </w:r>
-      <w:r>
-        <w:rPr>
-          <w:color w:val="333333"/>
-          <w:lang w:val="pt-BR"/>
-        </w:rPr>
-        <w:t xml:space="preserve"> M</w:t>
-      </w:r>
-      <w:r>
-        <w:rPr>
-          <w:color w:val="333333"/>
-          <w:lang w:val="pt-BR"/>
-        </w:rPr>
-        <w:t>ora</w:t>
-      </w:r>
-    </w:p>
-    <w:p>
-      <w:pPr>
-        <w:rPr>
-          <w:lang w:val="pt-BR"/>
-        </w:rPr>
-      </w:pPr>
-    </w:p>
+        <w:t xml:space="preserve">       Giovana Carolina Cárdenas Mora</w:t>
+      </w:r>
+    </w:p>
+    <w:p/>
     <w:p>
       <w:pPr>
         <w:jc w:val="center"/>
-        <w:rPr>
-          <w:lang w:val="pt-BR"/>
-        </w:rPr>
       </w:pPr>
       <w:r>
         <w:rPr>
@@ -204,31 +135,8 @@
           <w:bCs/>
           <w:sz w:val="22"/>
           <w:szCs w:val="22"/>
-          <w:lang w:val="pt-BR"/>
         </w:rPr>
-        <w:t xml:space="preserve">Cátedra </w:t>
-      </w:r>
-      <w:proofErr w:type="spellStart"/>
-      <w:r>
-        <w:rPr>
-          <w:b/>
-          <w:bCs/>
-          <w:sz w:val="22"/>
-          <w:szCs w:val="22"/>
-          <w:lang w:val="pt-BR"/>
-        </w:rPr>
-        <w:t>Mateista</w:t>
-      </w:r>
-      <w:proofErr w:type="spellEnd"/>
-      <w:r>
-        <w:rPr>
-          <w:b/>
-          <w:bCs/>
-          <w:sz w:val="22"/>
-          <w:szCs w:val="22"/>
-          <w:lang w:val="pt-BR"/>
-        </w:rPr>
-        <w:t xml:space="preserve"> Tecnológica</w:t>
+        <w:t>Cátedra Mateista Tecnológica</w:t>
       </w:r>
     </w:p>
     <w:p>
@@ -541,7 +449,6 @@
         <w:shd w:val="clear" w:color="auto" w:fill="EBF3FB"/>
         <w:spacing w:after="200"/>
       </w:pPr>
-      <w:proofErr w:type="gramStart"/>
       <w:r>
         <w:t xml:space="preserve">🔗  </w:t>
       </w:r>
@@ -551,34 +458,7 @@
           <w:bCs/>
           <w:color w:val="1155CC"/>
         </w:rPr>
-        <w:t>https</w:t>
-      </w:r>
-      <w:proofErr w:type="gramEnd"/>
-      <w:r>
-        <w:rPr>
-          <w:b/>
-          <w:bCs/>
-          <w:color w:val="1155CC"/>
-        </w:rPr>
-        <w:t>://[tu-usuario</w:t>
-      </w:r>
-      <w:proofErr w:type="gramStart"/>
-      <w:r>
-        <w:rPr>
-          <w:b/>
-          <w:bCs/>
-          <w:color w:val="1155CC"/>
-        </w:rPr>
-        <w:t>].github.io</w:t>
-      </w:r>
-      <w:proofErr w:type="gramEnd"/>
-      <w:r>
-        <w:rPr>
-          <w:b/>
-          <w:bCs/>
-          <w:color w:val="1155CC"/>
-        </w:rPr>
-        <w:t>/herramientas-ofimáticas/</w:t>
+        <w:t>https://cris904fl.github.io/herramientas-ofim-ticas/</w:t>
       </w:r>
     </w:p>
     <w:p>
@@ -829,29 +709,7 @@
         <w:sz w:val="18"/>
         <w:szCs w:val="18"/>
       </w:rPr>
-      <w:t xml:space="preserve">HERRAMIENTAS </w:t>
-    </w:r>
-    <w:proofErr w:type="gramStart"/>
-    <w:r>
-      <w:rPr>
-        <w:b/>
-        <w:bCs/>
-        <w:color w:val="2E75B6"/>
-        <w:sz w:val="18"/>
-        <w:szCs w:val="18"/>
-      </w:rPr>
-      <w:t>OFIMÁTICAS  |</w:t>
-    </w:r>
-    <w:proofErr w:type="gramEnd"/>
-    <w:r>
-      <w:rPr>
-        <w:b/>
-        <w:bCs/>
-        <w:color w:val="2E75B6"/>
-        <w:sz w:val="18"/>
-        <w:szCs w:val="18"/>
-      </w:rPr>
-      <w:t xml:space="preserve">  Unidad 1</w:t>
+      <w:t>HERRAMIENTAS OFIMÁTICAS  |  Unidad 1</w:t>
     </w:r>
     <w:r>
       <w:rPr>

</xml_diff>